<commit_message>
Fix DOC-7: merge 說明/擬辦 labels with content into same paragraph
Co-Authored-By: Claude Opus 4.6 <noreply@anthropic.com>
</commit_message>
<xml_diff>
--- a/public/templates/DOC-7.docx
+++ b/public/templates/DOC-7.docx
@@ -43,7 +43,7 @@
     </w:p>
     <w:p>
       <w:pPr>
-        <w:spacing w:after="100"/>
+        <w:spacing w:after="300"/>
       </w:pPr>
       <w:r>
         <w:rPr>
@@ -55,12 +55,6 @@
         </w:rPr>
         <w:t xml:space="preserve">說明：</w:t>
       </w:r>
-    </w:p>
-    <w:p>
-      <w:pPr>
-        <w:spacing w:after="300"/>
-        <w:ind w:left="480"/>
-      </w:pPr>
       <w:r>
         <w:rPr>
           <w:rFonts w:ascii="標楷體" w:cs="標楷體" w:eastAsia="標楷體" w:hAnsi="標楷體"/>
@@ -71,9 +65,6 @@
       </w:r>
     </w:p>
     <w:p>
-      <w:pPr>
-        <w:spacing w:after="100"/>
-      </w:pPr>
       <w:r>
         <w:rPr>
           <w:rFonts w:ascii="標楷體" w:cs="標楷體" w:eastAsia="標楷體" w:hAnsi="標楷體"/>
@@ -84,11 +75,6 @@
         </w:rPr>
         <w:t xml:space="preserve">擬辦：</w:t>
       </w:r>
-    </w:p>
-    <w:p>
-      <w:pPr>
-        <w:ind w:left="480"/>
-      </w:pPr>
       <w:r>
         <w:rPr>
           <w:rFonts w:ascii="標楷體" w:cs="標楷體" w:eastAsia="標楷體" w:hAnsi="標楷體"/>

</xml_diff>